<commit_message>
Refresh technical note with scientific audit findings
</commit_message>
<xml_diff>
--- a/technical_report/CHEMCODEX_ENVIRONMENTAL_RISK_TECHNICAL_NOTE_v0.1.docx
+++ b/technical_report/CHEMCODEX_ENVIRONMENTAL_RISK_TECHNICAL_NOTE_v0.1.docx
@@ -257,7 +257,7 @@
     </w:p>
     <w:p>
       <w:r>
-        <w:t>The consolidated architecture has six stages.</w:t>
+        <w:t>The consolidated architecture is best represented as a nine-layer chain.</w:t>
       </w:r>
     </w:p>
     <w:p>
@@ -287,7 +287,22 @@
     </w:p>
     <w:p>
       <w:r>
-        <w:t>Tier 5 - escalation. Route unsuitable screening cases to hydrodynamic modelling, whole-effluent toxicity, specialist metal assessment or monitoring.</w:t>
+        <w:t>Tier 5 - exposure. Calculate water/sediment PEC from mass release, discharge, dilution/fate, degradation/partitioning and scenario geometry with all defaults visible.</w:t>
+      </w:r>
+    </w:p>
+    <w:p>
+      <w:r>
+        <w:t>Tier 6 - risk characterisation. Calculate PEC/PNEC or another relevant metric by compartment with uncertainty, data-quality and validity flags.</w:t>
+      </w:r>
+    </w:p>
+    <w:p>
+      <w:r>
+        <w:t>Tier 7 - escalation. Route unsuitable screening cases to hydrodynamic modelling, whole-effluent toxicity, specialist metal assessment, sediment modelling or monitoring.</w:t>
+      </w:r>
+    </w:p>
+    <w:p>
+      <w:r>
+        <w:t>Tier 8 - report and audit. Preserve a machine-readable evidence package, human-readable report, rule/version identifiers and reviewer decisions.</w:t>
       </w:r>
     </w:p>
     <w:p>
@@ -295,7 +310,103 @@
         <w:pStyle w:val="Heading1"/>
       </w:pPr>
       <w:r>
-        <w:t>8. What remains unresolved</w:t>
+        <w:t>8. Technical audit: parameters that should not become hidden defaults</w:t>
+      </w:r>
+    </w:p>
+    <w:p>
+      <w:r>
+        <w:t>The final project-history audit recovered several numerical parameters that are important to preserve because they explain what the historical prototypes actually did.</w:t>
+      </w:r>
+    </w:p>
+    <w:p>
+      <w:r>
+        <w:t>They are not recommended universal defaults.</w:t>
+      </w:r>
+    </w:p>
+    <w:p>
+      <w:r>
+        <w:t>Historical implementations included:</w:t>
+      </w:r>
+    </w:p>
+    <w:p>
+      <w:pPr>
+        <w:pStyle w:val="ListBullet"/>
+      </w:pPr>
+      <w:r>
+        <w:t>BCF 1,000 as a bioaccumulation trigger in some workbook/SOP versions;</w:t>
+      </w:r>
+    </w:p>
+    <w:p>
+      <w:pPr>
+        <w:pStyle w:val="ListBullet"/>
+      </w:pPr>
+      <w:r>
+        <w:t>experimental algae and daphnia species weights of 2 and 1.5 in the JavaScript engine;</w:t>
+      </w:r>
+    </w:p>
+    <w:p>
+      <w:pPr>
+        <w:pStyle w:val="ListBullet"/>
+      </w:pPr>
+      <w:r>
+        <w:t>screening dilution factors including 100, 500 and 1,000 in the ERA workbook;</w:t>
+      </w:r>
+    </w:p>
+    <w:p>
+      <w:pPr>
+        <w:pStyle w:val="ListBullet"/>
+      </w:pPr>
+      <w:r>
+        <w:t>an additional regional-water step using a further 10-fold reduction;</w:t>
+      </w:r>
+    </w:p>
+    <w:p>
+      <w:pPr>
+        <w:pStyle w:val="ListBullet"/>
+      </w:pPr>
+      <w:r>
+        <w:t>fixed acute and chronic assessment factors of 1,000 and 100 in the 2026 deterministic experiment;</w:t>
+      </w:r>
+    </w:p>
+    <w:p>
+      <w:pPr>
+        <w:pStyle w:val="ListBullet"/>
+      </w:pPr>
+      <w:r>
+        <w:t>an experimental default PEC of 0.05 mg/L.</w:t>
+      </w:r>
+    </w:p>
+    <w:p>
+      <w:r>
+        <w:t>The scientific audit makes the distinction explicit.</w:t>
+      </w:r>
+    </w:p>
+    <w:p>
+      <w:r>
+        <w:t>For REACH Annex XIII, BCF &gt;2,000 is the B criterion and BCF &gt;5,000 is the vB criterion. LogKow can support screening but is not itself the final Annex XIII B/vB decision.</w:t>
+      </w:r>
+    </w:p>
+    <w:p>
+      <w:r>
+        <w:t>M-factors under CLP are substance-specific multipliers tied to Aquatic Acute 1 and/or Aquatic Chronic 1 classification and mixture summation, rather than a universal generic table.</w:t>
+      </w:r>
+    </w:p>
+    <w:p>
+      <w:r>
+        <w:t>PNEC assessment factors must depend on the available ecotoxicity dataset and the applicable method. PEC values and dilution/fate assumptions must come from the actual release scenario.</w:t>
+      </w:r>
+    </w:p>
+    <w:p>
+      <w:r>
+        <w:t>Sediment exposure also remains a higher-tier module. A defensible future implementation should document partitioning basis, deposition/fate, sediment mixing depth, density, bioavailability and the link between water and sediment exposure.</w:t>
+      </w:r>
+    </w:p>
+    <w:p>
+      <w:pPr>
+        <w:pStyle w:val="Heading1"/>
+      </w:pPr>
+      <w:r>
+        <w:t>9. What remains unresolved</w:t>
       </w:r>
     </w:p>
     <w:p>
@@ -323,7 +434,7 @@
         <w:pStyle w:val="Heading1"/>
       </w:pPr>
       <w:r>
-        <w:t>9. Public prototype code</w:t>
+        <w:t>10. Public prototype code</w:t>
       </w:r>
     </w:p>
     <w:p>
@@ -351,7 +462,7 @@
         <w:pStyle w:val="Heading1"/>
       </w:pPr>
       <w:r>
-        <w:t>10. Validation needed</w:t>
+        <w:t>11. Validation needed</w:t>
       </w:r>
     </w:p>
     <w:p>
@@ -379,7 +490,7 @@
         <w:pStyle w:val="Heading1"/>
       </w:pPr>
       <w:r>
-        <w:t>11. Longer-term use</w:t>
+        <w:t>12. Longer-term use</w:t>
       </w:r>
     </w:p>
     <w:p>

</xml_diff>

<commit_message>
Rebuild corrected v0.1.2 technical note
</commit_message>
<xml_diff>
--- a/technical_report/CHEMCODEX_ENVIRONMENTAL_RISK_TECHNICAL_NOTE_v0.1.docx
+++ b/technical_report/CHEMCODEX_ENVIRONMENTAL_RISK_TECHNICAL_NOTE_v0.1.docx
@@ -262,27 +262,27 @@
     </w:p>
     <w:p>
       <w:r>
-        <w:t>Tier 0 - identity and regulatory context. Product/components, CAS/EC, composition, H-codes, relevant OSPAR/HOCNF/PLONOR/REACH context, release scenario and data-quality status.</w:t>
+        <w:t>Tier 0 - identity and context. Product/components, CAS/EC, concentration ranges, intended use/release, freshwater or marine context, applicable jurisdiction and data-quality/confidentiality status.</w:t>
       </w:r>
     </w:p>
     <w:p>
       <w:r>
-        <w:t>Tier 1 - evidence-controlled extraction. Acute/chronic aquatic endpoints, species, duration, reliability, PBT/vPvB evidence, BCF/logKow, biodegradation, solubility, metals/inorganics and whole-mixture versus component evidence.</w:t>
+        <w:t>Tier 1 - evidence extraction. Structured evidence objects retain source section/page, endpoint type, species, duration, value, unit, comparator, reliability and measured/guideline/read-across/QSAR status.</w:t>
       </w:r>
     </w:p>
     <w:p>
       <w:r>
-        <w:t>Tier 2 - effect assessment. Select a defensible endpoint and derive a compartment-appropriate PNEC or other effect threshold while preserving the assessment factor, method and justification.</w:t>
+        <w:t>Tier 2 - regulatory routing. Versioned REACH/CLP/OSPAR/HOCNF/PLONOR flags route the assessment workflow without silently declaring universal safety.</w:t>
       </w:r>
     </w:p>
     <w:p>
       <w:r>
-        <w:t>Tier 3 - exposure assessment. Calculate PEC using release mass, duration, receiving environment, dilution/fate and partitioning assumptions. Defaults, if used, must be visible scenario parameters.</w:t>
+        <w:t>Tier 3 - intrinsic hazard. Characterise acute/chronic aquatic hazard, bioaccumulation, persistence, metals/inorganics and whole-mixture/component evidence without hiding unsupported composite scores.</w:t>
       </w:r>
     </w:p>
     <w:p>
       <w:r>
-        <w:t>Tier 4 - risk characterisation. Compare exposure with effect, retain uncertainty and identify sensitive compartments or missing evidence.</w:t>
+        <w:t>Tier 4 - effect assessment. Derive PNEC or another applicable effect threshold from selected evidence with an explicit assessment-factor rule and justification.</w:t>
       </w:r>
     </w:p>
     <w:p>
@@ -303,6 +303,11 @@
     <w:p>
       <w:r>
         <w:t>Tier 8 - report and audit. Preserve a machine-readable evidence package, human-readable report, rule/version identifiers and reviewer decisions.</w:t>
+      </w:r>
+    </w:p>
+    <w:p>
+      <w:r>
+        <w:t>The architectural principle is decoupling: the AI extraction model should be replaceable without changing the deterministic environmental rules, and regulatory-rule changes should not require retraining the extraction model.</w:t>
       </w:r>
     </w:p>
     <w:p>

</xml_diff>